<commit_message>
Update Proyecto_Transversal - entrega 2.docx
</commit_message>
<xml_diff>
--- a/docs/Proyecto_Transversal - entrega 2.docx
+++ b/docs/Proyecto_Transversal - entrega 2.docx
@@ -167,8 +167,18 @@
           <w:sz w:val="24"/>
           <w:szCs w:val="24"/>
         </w:rPr>
-        <w:t>El repositorio se encuentra disponible y fue habilitado a los usuarios de @guscastilloa y @juanjo-edm, el nombre del repositorio es: HybridWorking_GPI</w:t>
-      </w:r>
+        <w:t xml:space="preserve">El repositorio se encuentra disponible y fue habilitado a los usuarios de @guscastilloa y @juanjo-edm, el nombre del repositorio es: </w:t>
+      </w:r>
+      <w:proofErr w:type="spellStart"/>
+      <w:r>
+        <w:rPr>
+          <w:rFonts w:ascii="Arial" w:hAnsi="Arial" w:cs="Arial"/>
+          <w:sz w:val="24"/>
+          <w:szCs w:val="24"/>
+        </w:rPr>
+        <w:t>HybridWorking_GPI</w:t>
+      </w:r>
+      <w:proofErr w:type="spellEnd"/>
     </w:p>
     <w:p>
       <w:pPr>
@@ -236,7 +246,107 @@
           <w:szCs w:val="24"/>
           <w:lang w:val="en-US"/>
         </w:rPr>
-        <w:t xml:space="preserve">Se selecciono el paper “Hybrid working from home improves retention without damaging performance” realizadó por Bloom, N., Han, R., &amp; Liang, J. en 2024. </w:t>
+        <w:t xml:space="preserve">Se </w:t>
+      </w:r>
+      <w:proofErr w:type="spellStart"/>
+      <w:r>
+        <w:rPr>
+          <w:rFonts w:ascii="Arial" w:hAnsi="Arial" w:cs="Arial"/>
+          <w:sz w:val="24"/>
+          <w:szCs w:val="24"/>
+          <w:lang w:val="en-US"/>
+        </w:rPr>
+        <w:t>selecciono</w:t>
+      </w:r>
+      <w:proofErr w:type="spellEnd"/>
+      <w:r>
+        <w:rPr>
+          <w:rFonts w:ascii="Arial" w:hAnsi="Arial" w:cs="Arial"/>
+          <w:sz w:val="24"/>
+          <w:szCs w:val="24"/>
+          <w:lang w:val="en-US"/>
+        </w:rPr>
+        <w:t xml:space="preserve"> </w:t>
+      </w:r>
+      <w:proofErr w:type="spellStart"/>
+      <w:r>
+        <w:rPr>
+          <w:rFonts w:ascii="Arial" w:hAnsi="Arial" w:cs="Arial"/>
+          <w:sz w:val="24"/>
+          <w:szCs w:val="24"/>
+          <w:lang w:val="en-US"/>
+        </w:rPr>
+        <w:t>el</w:t>
+      </w:r>
+      <w:proofErr w:type="spellEnd"/>
+      <w:r>
+        <w:rPr>
+          <w:rFonts w:ascii="Arial" w:hAnsi="Arial" w:cs="Arial"/>
+          <w:sz w:val="24"/>
+          <w:szCs w:val="24"/>
+          <w:lang w:val="en-US"/>
+        </w:rPr>
+        <w:t xml:space="preserve"> paper “Hybrid working from home improves retention without damaging performance” </w:t>
+      </w:r>
+      <w:proofErr w:type="spellStart"/>
+      <w:r>
+        <w:rPr>
+          <w:rFonts w:ascii="Arial" w:hAnsi="Arial" w:cs="Arial"/>
+          <w:sz w:val="24"/>
+          <w:szCs w:val="24"/>
+          <w:lang w:val="en-US"/>
+        </w:rPr>
+        <w:t>realizadó</w:t>
+      </w:r>
+      <w:proofErr w:type="spellEnd"/>
+      <w:r>
+        <w:rPr>
+          <w:rFonts w:ascii="Arial" w:hAnsi="Arial" w:cs="Arial"/>
+          <w:sz w:val="24"/>
+          <w:szCs w:val="24"/>
+          <w:lang w:val="en-US"/>
+        </w:rPr>
+        <w:t xml:space="preserve"> </w:t>
+      </w:r>
+      <w:proofErr w:type="spellStart"/>
+      <w:r>
+        <w:rPr>
+          <w:rFonts w:ascii="Arial" w:hAnsi="Arial" w:cs="Arial"/>
+          <w:sz w:val="24"/>
+          <w:szCs w:val="24"/>
+          <w:lang w:val="en-US"/>
+        </w:rPr>
+        <w:t>por</w:t>
+      </w:r>
+      <w:proofErr w:type="spellEnd"/>
+      <w:r>
+        <w:rPr>
+          <w:rFonts w:ascii="Arial" w:hAnsi="Arial" w:cs="Arial"/>
+          <w:sz w:val="24"/>
+          <w:szCs w:val="24"/>
+          <w:lang w:val="en-US"/>
+        </w:rPr>
+        <w:t xml:space="preserve"> Bloom, N., Han, R., &amp; Liang, J. </w:t>
+      </w:r>
+      <w:proofErr w:type="spellStart"/>
+      <w:r>
+        <w:rPr>
+          <w:rFonts w:ascii="Arial" w:hAnsi="Arial" w:cs="Arial"/>
+          <w:sz w:val="24"/>
+          <w:szCs w:val="24"/>
+          <w:lang w:val="en-US"/>
+        </w:rPr>
+        <w:t>en</w:t>
+      </w:r>
+      <w:proofErr w:type="spellEnd"/>
+      <w:r>
+        <w:rPr>
+          <w:rFonts w:ascii="Arial" w:hAnsi="Arial" w:cs="Arial"/>
+          <w:sz w:val="24"/>
+          <w:szCs w:val="24"/>
+          <w:lang w:val="en-US"/>
+        </w:rPr>
+        <w:t xml:space="preserve"> 2024. </w:t>
       </w:r>
       <w:r>
         <w:rPr>
@@ -260,25 +370,97 @@
           <w:sz w:val="24"/>
           <w:szCs w:val="24"/>
         </w:rPr>
-        <w:t xml:space="preserve"> porque es el actual esquema de trabajo de los integrantes que elaboran el presente documento y cada uno percibe beneficios en productividad, satisfacción laboral, movilidad y balance de vida personal – laboral. No obstante, existe debate al respecto en cuanto a ventajas y desventajas de esta modalidad entre empresas, empleados y demás agentes de interes. Como estudiantes de la MECA es de interes conocer la metodología usada en el artículo y replicarlo para probar dichos impactos ya sean positivos o negativos del trabajo en modalidad hibrida y demostrarlos de manera cuatificada.</w:t>
-      </w:r>
-    </w:p>
-    <w:p>
-      <w:pPr>
-        <w:jc w:val="both"/>
-        <w:rPr>
-          <w:rFonts w:ascii="Arial" w:hAnsi="Arial" w:cs="Arial"/>
-          <w:sz w:val="24"/>
-          <w:szCs w:val="24"/>
-        </w:rPr>
-      </w:pPr>
-      <w:r>
-        <w:rPr>
-          <w:rFonts w:ascii="Arial" w:hAnsi="Arial" w:cs="Arial"/>
-          <w:sz w:val="24"/>
-          <w:szCs w:val="24"/>
-        </w:rPr>
-        <w:t xml:space="preserve">Este tema es relevante para los trabajadores en Colombia puesto que la modalidad hibrida se encuentra en auge y ya amparada por la Ley 2466 de 2025. La cuarta edición de la encuesta EY Work Reimagined de 2024 revelo que en Colombia el 90% de los colombianos prefiere un esquema de trabajo híbrido, con al menos 2 días de trabajo remoto; no obstante, también reveló que la conexión social es una de las principales razones por las que desean asistir al lugar de trabajo. </w:t>
+        <w:t xml:space="preserve"> porque es el actual esquema de trabajo de los integrantes que elaboran el presente documento y cada uno percibe beneficios en productividad, satisfacción laboral, movilidad y balance de vida personal – laboral. No obstante, existe debate al respecto en cuanto a ventajas y desventajas de esta modalidad entre empresas, empleados y demás agentes de </w:t>
+      </w:r>
+      <w:proofErr w:type="spellStart"/>
+      <w:r>
+        <w:rPr>
+          <w:rFonts w:ascii="Arial" w:hAnsi="Arial" w:cs="Arial"/>
+          <w:sz w:val="24"/>
+          <w:szCs w:val="24"/>
+        </w:rPr>
+        <w:t>interes</w:t>
+      </w:r>
+      <w:proofErr w:type="spellEnd"/>
+      <w:r>
+        <w:rPr>
+          <w:rFonts w:ascii="Arial" w:hAnsi="Arial" w:cs="Arial"/>
+          <w:sz w:val="24"/>
+          <w:szCs w:val="24"/>
+        </w:rPr>
+        <w:t xml:space="preserve">. Como estudiantes de la MECA es de </w:t>
+      </w:r>
+      <w:proofErr w:type="spellStart"/>
+      <w:r>
+        <w:rPr>
+          <w:rFonts w:ascii="Arial" w:hAnsi="Arial" w:cs="Arial"/>
+          <w:sz w:val="24"/>
+          <w:szCs w:val="24"/>
+        </w:rPr>
+        <w:t>interes</w:t>
+      </w:r>
+      <w:proofErr w:type="spellEnd"/>
+      <w:r>
+        <w:rPr>
+          <w:rFonts w:ascii="Arial" w:hAnsi="Arial" w:cs="Arial"/>
+          <w:sz w:val="24"/>
+          <w:szCs w:val="24"/>
+        </w:rPr>
+        <w:t xml:space="preserve"> conocer la metodología usada en el artículo y replicarlo para probar dichos impactos ya sean positivos o negativos del trabajo en modalidad hibrida y demostrarlos de manera </w:t>
+      </w:r>
+      <w:proofErr w:type="spellStart"/>
+      <w:r>
+        <w:rPr>
+          <w:rFonts w:ascii="Arial" w:hAnsi="Arial" w:cs="Arial"/>
+          <w:sz w:val="24"/>
+          <w:szCs w:val="24"/>
+        </w:rPr>
+        <w:t>cuatificada</w:t>
+      </w:r>
+      <w:proofErr w:type="spellEnd"/>
+      <w:r>
+        <w:rPr>
+          <w:rFonts w:ascii="Arial" w:hAnsi="Arial" w:cs="Arial"/>
+          <w:sz w:val="24"/>
+          <w:szCs w:val="24"/>
+        </w:rPr>
+        <w:t>.</w:t>
+      </w:r>
+    </w:p>
+    <w:p>
+      <w:pPr>
+        <w:jc w:val="both"/>
+        <w:rPr>
+          <w:rFonts w:ascii="Arial" w:hAnsi="Arial" w:cs="Arial"/>
+          <w:sz w:val="24"/>
+          <w:szCs w:val="24"/>
+        </w:rPr>
+      </w:pPr>
+      <w:r>
+        <w:rPr>
+          <w:rFonts w:ascii="Arial" w:hAnsi="Arial" w:cs="Arial"/>
+          <w:sz w:val="24"/>
+          <w:szCs w:val="24"/>
+        </w:rPr>
+        <w:t xml:space="preserve">Este tema es relevante para los trabajadores en Colombia puesto que la modalidad hibrida se encuentra en auge y ya amparada por la Ley 2466 de 2025. La cuarta edición de la encuesta EY Work </w:t>
+      </w:r>
+      <w:proofErr w:type="spellStart"/>
+      <w:r>
+        <w:rPr>
+          <w:rFonts w:ascii="Arial" w:hAnsi="Arial" w:cs="Arial"/>
+          <w:sz w:val="24"/>
+          <w:szCs w:val="24"/>
+        </w:rPr>
+        <w:t>Reimagined</w:t>
+      </w:r>
+      <w:proofErr w:type="spellEnd"/>
+      <w:r>
+        <w:rPr>
+          <w:rFonts w:ascii="Arial" w:hAnsi="Arial" w:cs="Arial"/>
+          <w:sz w:val="24"/>
+          <w:szCs w:val="24"/>
+        </w:rPr>
+        <w:t xml:space="preserve"> de 2024 revelo que en Colombia el 90% de los colombianos prefiere un esquema de trabajo híbrido, con al menos 2 días de trabajo remoto; no obstante, también reveló que la conexión social es una de las principales razones por las que desean asistir al lugar de trabajo. </w:t>
       </w:r>
     </w:p>
     <w:p>
@@ -639,7 +821,139 @@
           <w:sz w:val="24"/>
           <w:szCs w:val="24"/>
         </w:rPr>
-        <w:t>Hybrid working from home improves retention without damaging performance</w:t>
+        <w:t xml:space="preserve">Hybrid </w:t>
+      </w:r>
+      <w:proofErr w:type="spellStart"/>
+      <w:r>
+        <w:rPr>
+          <w:rFonts w:ascii="Arial" w:hAnsi="Arial" w:cs="Arial"/>
+          <w:i/>
+          <w:iCs/>
+          <w:sz w:val="24"/>
+          <w:szCs w:val="24"/>
+        </w:rPr>
+        <w:t>working</w:t>
+      </w:r>
+      <w:proofErr w:type="spellEnd"/>
+      <w:r>
+        <w:rPr>
+          <w:rFonts w:ascii="Arial" w:hAnsi="Arial" w:cs="Arial"/>
+          <w:i/>
+          <w:iCs/>
+          <w:sz w:val="24"/>
+          <w:szCs w:val="24"/>
+        </w:rPr>
+        <w:t xml:space="preserve"> </w:t>
+      </w:r>
+      <w:proofErr w:type="spellStart"/>
+      <w:r>
+        <w:rPr>
+          <w:rFonts w:ascii="Arial" w:hAnsi="Arial" w:cs="Arial"/>
+          <w:i/>
+          <w:iCs/>
+          <w:sz w:val="24"/>
+          <w:szCs w:val="24"/>
+        </w:rPr>
+        <w:t>from</w:t>
+      </w:r>
+      <w:proofErr w:type="spellEnd"/>
+      <w:r>
+        <w:rPr>
+          <w:rFonts w:ascii="Arial" w:hAnsi="Arial" w:cs="Arial"/>
+          <w:i/>
+          <w:iCs/>
+          <w:sz w:val="24"/>
+          <w:szCs w:val="24"/>
+        </w:rPr>
+        <w:t xml:space="preserve"> home </w:t>
+      </w:r>
+      <w:proofErr w:type="spellStart"/>
+      <w:r>
+        <w:rPr>
+          <w:rFonts w:ascii="Arial" w:hAnsi="Arial" w:cs="Arial"/>
+          <w:i/>
+          <w:iCs/>
+          <w:sz w:val="24"/>
+          <w:szCs w:val="24"/>
+        </w:rPr>
+        <w:t>improves</w:t>
+      </w:r>
+      <w:proofErr w:type="spellEnd"/>
+      <w:r>
+        <w:rPr>
+          <w:rFonts w:ascii="Arial" w:hAnsi="Arial" w:cs="Arial"/>
+          <w:i/>
+          <w:iCs/>
+          <w:sz w:val="24"/>
+          <w:szCs w:val="24"/>
+        </w:rPr>
+        <w:t xml:space="preserve"> </w:t>
+      </w:r>
+      <w:proofErr w:type="spellStart"/>
+      <w:r>
+        <w:rPr>
+          <w:rFonts w:ascii="Arial" w:hAnsi="Arial" w:cs="Arial"/>
+          <w:i/>
+          <w:iCs/>
+          <w:sz w:val="24"/>
+          <w:szCs w:val="24"/>
+        </w:rPr>
+        <w:t>retention</w:t>
+      </w:r>
+      <w:proofErr w:type="spellEnd"/>
+      <w:r>
+        <w:rPr>
+          <w:rFonts w:ascii="Arial" w:hAnsi="Arial" w:cs="Arial"/>
+          <w:i/>
+          <w:iCs/>
+          <w:sz w:val="24"/>
+          <w:szCs w:val="24"/>
+        </w:rPr>
+        <w:t xml:space="preserve"> </w:t>
+      </w:r>
+      <w:proofErr w:type="spellStart"/>
+      <w:r>
+        <w:rPr>
+          <w:rFonts w:ascii="Arial" w:hAnsi="Arial" w:cs="Arial"/>
+          <w:i/>
+          <w:iCs/>
+          <w:sz w:val="24"/>
+          <w:szCs w:val="24"/>
+        </w:rPr>
+        <w:t>without</w:t>
+      </w:r>
+      <w:proofErr w:type="spellEnd"/>
+      <w:r>
+        <w:rPr>
+          <w:rFonts w:ascii="Arial" w:hAnsi="Arial" w:cs="Arial"/>
+          <w:i/>
+          <w:iCs/>
+          <w:sz w:val="24"/>
+          <w:szCs w:val="24"/>
+        </w:rPr>
+        <w:t xml:space="preserve"> </w:t>
+      </w:r>
+      <w:proofErr w:type="spellStart"/>
+      <w:r>
+        <w:rPr>
+          <w:rFonts w:ascii="Arial" w:hAnsi="Arial" w:cs="Arial"/>
+          <w:i/>
+          <w:iCs/>
+          <w:sz w:val="24"/>
+          <w:szCs w:val="24"/>
+        </w:rPr>
+        <w:t>damaging</w:t>
+      </w:r>
+      <w:proofErr w:type="spellEnd"/>
+      <w:r>
+        <w:rPr>
+          <w:rFonts w:ascii="Arial" w:hAnsi="Arial" w:cs="Arial"/>
+          <w:i/>
+          <w:iCs/>
+          <w:sz w:val="24"/>
+          <w:szCs w:val="24"/>
+        </w:rPr>
+        <w:t xml:space="preserve"> performance</w:t>
       </w:r>
       <w:r>
         <w:rPr>
@@ -663,15 +977,51 @@
           <w:sz w:val="24"/>
           <w:szCs w:val="24"/>
         </w:rPr>
-        <w:t xml:space="preserve">mediante el DOI paper: </w:t>
-      </w:r>
-      <w:r>
-        <w:rPr>
-          <w:rFonts w:ascii="Arial" w:hAnsi="Arial" w:cs="Arial"/>
-          <w:sz w:val="24"/>
-          <w:szCs w:val="24"/>
-        </w:rPr>
-        <w:t>DOI paper: 10.1038/s41586-024-07500-2</w:t>
+        <w:t xml:space="preserve">mediante el DOI </w:t>
+      </w:r>
+      <w:proofErr w:type="spellStart"/>
+      <w:r>
+        <w:rPr>
+          <w:rFonts w:ascii="Arial" w:hAnsi="Arial" w:cs="Arial"/>
+          <w:sz w:val="24"/>
+          <w:szCs w:val="24"/>
+        </w:rPr>
+        <w:t>paper</w:t>
+      </w:r>
+      <w:proofErr w:type="spellEnd"/>
+      <w:r>
+        <w:rPr>
+          <w:rFonts w:ascii="Arial" w:hAnsi="Arial" w:cs="Arial"/>
+          <w:sz w:val="24"/>
+          <w:szCs w:val="24"/>
+        </w:rPr>
+        <w:t xml:space="preserve">: </w:t>
+      </w:r>
+      <w:r>
+        <w:rPr>
+          <w:rFonts w:ascii="Arial" w:hAnsi="Arial" w:cs="Arial"/>
+          <w:sz w:val="24"/>
+          <w:szCs w:val="24"/>
+        </w:rPr>
+        <w:t xml:space="preserve">DOI </w:t>
+      </w:r>
+      <w:proofErr w:type="spellStart"/>
+      <w:r>
+        <w:rPr>
+          <w:rFonts w:ascii="Arial" w:hAnsi="Arial" w:cs="Arial"/>
+          <w:sz w:val="24"/>
+          <w:szCs w:val="24"/>
+        </w:rPr>
+        <w:t>paper</w:t>
+      </w:r>
+      <w:proofErr w:type="spellEnd"/>
+      <w:r>
+        <w:rPr>
+          <w:rFonts w:ascii="Arial" w:hAnsi="Arial" w:cs="Arial"/>
+          <w:sz w:val="24"/>
+          <w:szCs w:val="24"/>
+        </w:rPr>
+        <w:t>: 10.1038/s41586-024-07500-2</w:t>
       </w:r>
       <w:r>
         <w:rPr>
@@ -1045,7 +1395,538 @@
         <w:t>Metodología de Reproducción</w:t>
       </w:r>
     </w:p>
-    <w:p/>
+    <w:p>
+      <w:pPr>
+        <w:rPr>
+          <w:rFonts w:ascii="Times New Roman" w:hAnsi="Times New Roman" w:cs="Times New Roman"/>
+          <w:b/>
+          <w:bCs/>
+        </w:rPr>
+      </w:pPr>
+      <w:r>
+        <w:rPr>
+          <w:rFonts w:ascii="Times New Roman" w:hAnsi="Times New Roman" w:cs="Times New Roman"/>
+          <w:b/>
+          <w:bCs/>
+        </w:rPr>
+        <w:t>Estrategia implementada</w:t>
+      </w:r>
+    </w:p>
+    <w:p>
+      <w:pPr>
+        <w:rPr>
+          <w:rFonts w:ascii="Times New Roman" w:hAnsi="Times New Roman" w:cs="Times New Roman"/>
+        </w:rPr>
+      </w:pPr>
+      <w:r>
+        <w:rPr>
+          <w:rFonts w:ascii="Times New Roman" w:hAnsi="Times New Roman" w:cs="Times New Roman"/>
+        </w:rPr>
+        <w:t>Para este avance, la estrategia de reproducción se centró en un solo resultado del artículo, específicamente la Figura 2. Esta figura fue escogida porque resume de forma clara uno de los hallazgos principales del estudio y al mismo tiempo, permite trabajar con un resultado concreto, tal como lo plantea el proyecto del curso. A partir de esa decisión, el trabajo se organizó en una secuencia simple. Primero se identificaron los archivos necesarios dentro del material de replicación. Después se descargaron y prepararon los datos asociados a la figura seleccionada. Luego se ejecutó el código para reconstruir los resultados y generar una nueva versión de la figura. Finalmente se dejó lista una salida intermedia con los valores obtenidos para facilitar la comparación con lo reportado en el artículo.</w:t>
+      </w:r>
+    </w:p>
+    <w:p>
+      <w:pPr>
+        <w:rPr>
+          <w:rFonts w:ascii="Times New Roman" w:hAnsi="Times New Roman" w:cs="Times New Roman"/>
+        </w:rPr>
+      </w:pPr>
+      <w:r>
+        <w:rPr>
+          <w:rFonts w:ascii="Times New Roman" w:hAnsi="Times New Roman" w:cs="Times New Roman"/>
+        </w:rPr>
+        <w:t xml:space="preserve">La metodología seguida no buscó rehacer todo el estudio original, </w:t>
+      </w:r>
+      <w:r>
+        <w:rPr>
+          <w:rFonts w:ascii="Times New Roman" w:hAnsi="Times New Roman" w:cs="Times New Roman"/>
+        </w:rPr>
+        <w:t>se buscó</w:t>
+      </w:r>
+      <w:r>
+        <w:rPr>
+          <w:rFonts w:ascii="Times New Roman" w:hAnsi="Times New Roman" w:cs="Times New Roman"/>
+        </w:rPr>
+        <w:t xml:space="preserve"> avanzar de manera ordenada sobre el resultado escogido. En ese sentido, se trabajó con el código disponible para la Figura 2 y se organizó dentro de la estructura del repositorio del equipo, de modo que el proceso quedara dividido en etapas y no como una sola ejecución aislada. Esto permitió separar mejor la descarga de datos, la generación de resultados y la validación posterior de los valores obtenidos.</w:t>
+      </w:r>
+    </w:p>
+    <w:p>
+      <w:pPr>
+        <w:rPr>
+          <w:rFonts w:ascii="Times New Roman" w:hAnsi="Times New Roman" w:cs="Times New Roman"/>
+          <w:b/>
+          <w:bCs/>
+        </w:rPr>
+      </w:pPr>
+      <w:r>
+        <w:rPr>
+          <w:rFonts w:ascii="Times New Roman" w:hAnsi="Times New Roman" w:cs="Times New Roman"/>
+          <w:b/>
+          <w:bCs/>
+        </w:rPr>
+        <w:t>Entorno computacional</w:t>
+      </w:r>
+    </w:p>
+    <w:p>
+      <w:pPr>
+        <w:rPr>
+          <w:rFonts w:ascii="Times New Roman" w:hAnsi="Times New Roman" w:cs="Times New Roman"/>
+        </w:rPr>
+      </w:pPr>
+      <w:r>
+        <w:rPr>
+          <w:rFonts w:ascii="Times New Roman" w:hAnsi="Times New Roman" w:cs="Times New Roman"/>
+        </w:rPr>
+        <w:t xml:space="preserve">La reproducción se desarrolló en Python. Los archivos revisados muestran el uso de librerías como pandas para manejo de datos, </w:t>
+      </w:r>
+      <w:proofErr w:type="spellStart"/>
+      <w:r>
+        <w:rPr>
+          <w:rFonts w:ascii="Times New Roman" w:hAnsi="Times New Roman" w:cs="Times New Roman"/>
+        </w:rPr>
+        <w:t>matplotlib</w:t>
+      </w:r>
+      <w:proofErr w:type="spellEnd"/>
+      <w:r>
+        <w:rPr>
+          <w:rFonts w:ascii="Times New Roman" w:hAnsi="Times New Roman" w:cs="Times New Roman"/>
+        </w:rPr>
+        <w:t xml:space="preserve"> para la construcción de la figura, </w:t>
+      </w:r>
+      <w:proofErr w:type="spellStart"/>
+      <w:r>
+        <w:rPr>
+          <w:rFonts w:ascii="Times New Roman" w:hAnsi="Times New Roman" w:cs="Times New Roman"/>
+        </w:rPr>
+        <w:t>numpy</w:t>
+      </w:r>
+      <w:proofErr w:type="spellEnd"/>
+      <w:r>
+        <w:rPr>
+          <w:rFonts w:ascii="Times New Roman" w:hAnsi="Times New Roman" w:cs="Times New Roman"/>
+        </w:rPr>
+        <w:t xml:space="preserve"> para apoyo en el manejo de arreglos, </w:t>
+      </w:r>
+      <w:proofErr w:type="spellStart"/>
+      <w:r>
+        <w:rPr>
+          <w:rFonts w:ascii="Times New Roman" w:hAnsi="Times New Roman" w:cs="Times New Roman"/>
+        </w:rPr>
+        <w:t>scipy</w:t>
+      </w:r>
+      <w:proofErr w:type="spellEnd"/>
+      <w:r>
+        <w:rPr>
+          <w:rFonts w:ascii="Times New Roman" w:hAnsi="Times New Roman" w:cs="Times New Roman"/>
+        </w:rPr>
+        <w:t xml:space="preserve"> para el cálculo estadístico y </w:t>
+      </w:r>
+      <w:proofErr w:type="spellStart"/>
+      <w:r>
+        <w:rPr>
+          <w:rFonts w:ascii="Times New Roman" w:hAnsi="Times New Roman" w:cs="Times New Roman"/>
+        </w:rPr>
+        <w:t>requests</w:t>
+      </w:r>
+      <w:proofErr w:type="spellEnd"/>
+      <w:r>
+        <w:rPr>
+          <w:rFonts w:ascii="Times New Roman" w:hAnsi="Times New Roman" w:cs="Times New Roman"/>
+        </w:rPr>
+        <w:t xml:space="preserve"> para la descarga de archivos desde la fuente original. Además, los scripts usan una configuración interna del proyecto para ubicar los datos de entrada y para guardar las salidas en carpetas separadas de tablas y figuras.</w:t>
+      </w:r>
+    </w:p>
+    <w:p>
+      <w:pPr>
+        <w:rPr>
+          <w:rFonts w:ascii="Times New Roman" w:hAnsi="Times New Roman" w:cs="Times New Roman"/>
+        </w:rPr>
+      </w:pPr>
+      <w:r>
+        <w:rPr>
+          <w:rFonts w:ascii="Times New Roman" w:hAnsi="Times New Roman" w:cs="Times New Roman"/>
+        </w:rPr>
+        <w:t xml:space="preserve">Dentro de esta configuración, el archivo principal para generar la réplica toma como entrada un archivo llamado </w:t>
+      </w:r>
+      <w:r>
+        <w:rPr>
+          <w:rFonts w:ascii="Times New Roman" w:hAnsi="Times New Roman" w:cs="Times New Roman"/>
+          <w:b/>
+          <w:bCs/>
+          <w:i/>
+          <w:iCs/>
+        </w:rPr>
+        <w:t>figure2.csv</w:t>
+      </w:r>
+      <w:r>
+        <w:rPr>
+          <w:rFonts w:ascii="Times New Roman" w:hAnsi="Times New Roman" w:cs="Times New Roman"/>
+        </w:rPr>
+        <w:t xml:space="preserve"> y guarda como salidas una imagen de la figura replicada y una tabla resumen con los valores calculados. También se emplea un modo de trabajo en </w:t>
+      </w:r>
+      <w:proofErr w:type="spellStart"/>
+      <w:r>
+        <w:rPr>
+          <w:rFonts w:ascii="Times New Roman" w:hAnsi="Times New Roman" w:cs="Times New Roman"/>
+        </w:rPr>
+        <w:t>matplotlib</w:t>
+      </w:r>
+      <w:proofErr w:type="spellEnd"/>
+      <w:r>
+        <w:rPr>
+          <w:rFonts w:ascii="Times New Roman" w:hAnsi="Times New Roman" w:cs="Times New Roman"/>
+        </w:rPr>
+        <w:t xml:space="preserve"> que </w:t>
+      </w:r>
+      <w:r>
+        <w:rPr>
+          <w:rFonts w:ascii="Times New Roman" w:hAnsi="Times New Roman" w:cs="Times New Roman"/>
+        </w:rPr>
+        <w:lastRenderedPageBreak/>
+        <w:t>permite guardar figuras directamente en archivos, lo cual facilita la ejecución del proceso dentro del repositorio sin depender de una visualización manual en pantalla.</w:t>
+      </w:r>
+    </w:p>
+    <w:p>
+      <w:pPr>
+        <w:rPr>
+          <w:rFonts w:ascii="Times New Roman" w:hAnsi="Times New Roman" w:cs="Times New Roman"/>
+          <w:b/>
+          <w:bCs/>
+        </w:rPr>
+      </w:pPr>
+      <w:r>
+        <w:rPr>
+          <w:rFonts w:ascii="Times New Roman" w:hAnsi="Times New Roman" w:cs="Times New Roman"/>
+          <w:b/>
+          <w:bCs/>
+        </w:rPr>
+        <w:t>Procesamiento de datos</w:t>
+      </w:r>
+    </w:p>
+    <w:p>
+      <w:pPr>
+        <w:rPr>
+          <w:rFonts w:ascii="Times New Roman" w:hAnsi="Times New Roman" w:cs="Times New Roman"/>
+        </w:rPr>
+      </w:pPr>
+      <w:r>
+        <w:rPr>
+          <w:rFonts w:ascii="Times New Roman" w:hAnsi="Times New Roman" w:cs="Times New Roman"/>
+        </w:rPr>
+        <w:t xml:space="preserve">El procesamiento comenzó con la descarga de los archivos necesarios para la figura seleccionada. Para esto se usó un script que resuelve el DOI del material de replicación, identifica si la fuente corresponde a </w:t>
+      </w:r>
+      <w:proofErr w:type="spellStart"/>
+      <w:r>
+        <w:rPr>
+          <w:rFonts w:ascii="Times New Roman" w:hAnsi="Times New Roman" w:cs="Times New Roman"/>
+        </w:rPr>
+        <w:t>Zenodo</w:t>
+      </w:r>
+      <w:proofErr w:type="spellEnd"/>
+      <w:r>
+        <w:rPr>
+          <w:rFonts w:ascii="Times New Roman" w:hAnsi="Times New Roman" w:cs="Times New Roman"/>
+        </w:rPr>
+        <w:t xml:space="preserve"> y aplica un filtro por nombre para ubicar los archivos relacionados con Figure 2. Cuando el archivo descargado viene en formato tabulado, el mismo proceso lo convierte a CSV y lo guarda en la carpeta de datos crudos del proyecto. Esto ayudó a dejar una base de trabajo más uniforme para las siguientes etapas.</w:t>
+      </w:r>
+    </w:p>
+    <w:p>
+      <w:pPr>
+        <w:rPr>
+          <w:rFonts w:ascii="Times New Roman" w:hAnsi="Times New Roman" w:cs="Times New Roman"/>
+        </w:rPr>
+      </w:pPr>
+      <w:r>
+        <w:rPr>
+          <w:rFonts w:ascii="Times New Roman" w:hAnsi="Times New Roman" w:cs="Times New Roman"/>
+        </w:rPr>
+        <w:t xml:space="preserve">Después de la descarga, se cargó el archivo </w:t>
+      </w:r>
+      <w:r>
+        <w:rPr>
+          <w:rFonts w:ascii="Times New Roman" w:hAnsi="Times New Roman" w:cs="Times New Roman"/>
+          <w:b/>
+          <w:bCs/>
+          <w:i/>
+          <w:iCs/>
+        </w:rPr>
+        <w:t>figure2.csv</w:t>
+      </w:r>
+      <w:r>
+        <w:rPr>
+          <w:rFonts w:ascii="Times New Roman" w:hAnsi="Times New Roman" w:cs="Times New Roman"/>
+        </w:rPr>
+        <w:t xml:space="preserve"> y se verificó que estuvieran presentes las columnas necesarias para reconstruir la figura. En particular, el script exige las variables </w:t>
+      </w:r>
+      <w:proofErr w:type="spellStart"/>
+      <w:r>
+        <w:rPr>
+          <w:rFonts w:ascii="Times New Roman" w:hAnsi="Times New Roman" w:cs="Times New Roman"/>
+          <w:b/>
+          <w:bCs/>
+          <w:i/>
+          <w:iCs/>
+        </w:rPr>
+        <w:t>treat</w:t>
+      </w:r>
+      <w:proofErr w:type="spellEnd"/>
+      <w:r>
+        <w:rPr>
+          <w:rFonts w:ascii="Times New Roman" w:hAnsi="Times New Roman" w:cs="Times New Roman"/>
+        </w:rPr>
+        <w:t xml:space="preserve">, </w:t>
+      </w:r>
+      <w:r>
+        <w:rPr>
+          <w:rFonts w:ascii="Times New Roman" w:hAnsi="Times New Roman" w:cs="Times New Roman"/>
+          <w:b/>
+          <w:bCs/>
+          <w:i/>
+          <w:iCs/>
+        </w:rPr>
+        <w:t>role</w:t>
+      </w:r>
+      <w:r>
+        <w:rPr>
+          <w:rFonts w:ascii="Times New Roman" w:hAnsi="Times New Roman" w:cs="Times New Roman"/>
+        </w:rPr>
+        <w:t xml:space="preserve">, </w:t>
+      </w:r>
+      <w:r>
+        <w:rPr>
+          <w:rFonts w:ascii="Times New Roman" w:hAnsi="Times New Roman" w:cs="Times New Roman"/>
+          <w:b/>
+          <w:bCs/>
+          <w:i/>
+          <w:iCs/>
+        </w:rPr>
+        <w:t>male</w:t>
+      </w:r>
+      <w:r>
+        <w:rPr>
+          <w:rFonts w:ascii="Times New Roman" w:hAnsi="Times New Roman" w:cs="Times New Roman"/>
+        </w:rPr>
+        <w:t xml:space="preserve">, </w:t>
+      </w:r>
+      <w:proofErr w:type="spellStart"/>
+      <w:r>
+        <w:rPr>
+          <w:rFonts w:ascii="Times New Roman" w:hAnsi="Times New Roman" w:cs="Times New Roman"/>
+          <w:b/>
+          <w:bCs/>
+          <w:i/>
+          <w:iCs/>
+        </w:rPr>
+        <w:t>live_far</w:t>
+      </w:r>
+      <w:proofErr w:type="spellEnd"/>
+      <w:r>
+        <w:rPr>
+          <w:rFonts w:ascii="Times New Roman" w:hAnsi="Times New Roman" w:cs="Times New Roman"/>
+        </w:rPr>
+        <w:t xml:space="preserve"> y </w:t>
+      </w:r>
+      <w:proofErr w:type="spellStart"/>
+      <w:r>
+        <w:rPr>
+          <w:rFonts w:ascii="Times New Roman" w:hAnsi="Times New Roman" w:cs="Times New Roman"/>
+          <w:b/>
+          <w:bCs/>
+          <w:i/>
+          <w:iCs/>
+        </w:rPr>
+        <w:t>attrite_perc</w:t>
+      </w:r>
+      <w:proofErr w:type="spellEnd"/>
+      <w:r>
+        <w:rPr>
+          <w:rFonts w:ascii="Times New Roman" w:hAnsi="Times New Roman" w:cs="Times New Roman"/>
+        </w:rPr>
+        <w:t xml:space="preserve">. Además, se revisa que las variables clave no tengan valores faltantes, que las variables binarias estén codificadas de forma consistente y que el tamaño de la base no se aleje de las 1,612 observaciones esperadas. El código también contempla que la variable de </w:t>
+      </w:r>
+      <w:proofErr w:type="spellStart"/>
+      <w:r>
+        <w:rPr>
+          <w:rFonts w:ascii="Times New Roman" w:hAnsi="Times New Roman" w:cs="Times New Roman"/>
+        </w:rPr>
+        <w:t>attrition</w:t>
+      </w:r>
+      <w:proofErr w:type="spellEnd"/>
+      <w:r>
+        <w:rPr>
+          <w:rFonts w:ascii="Times New Roman" w:hAnsi="Times New Roman" w:cs="Times New Roman"/>
+        </w:rPr>
+        <w:t xml:space="preserve"> pueda venir en escala de 0 a 100, por lo que en ese caso la convierte a una escala entre 0 y 1 antes de continuar con los cálculos.</w:t>
+      </w:r>
+    </w:p>
+    <w:p>
+      <w:pPr>
+        <w:rPr>
+          <w:rFonts w:ascii="Times New Roman" w:hAnsi="Times New Roman" w:cs="Times New Roman"/>
+        </w:rPr>
+      </w:pPr>
+      <w:r>
+        <w:rPr>
+          <w:rFonts w:ascii="Times New Roman" w:hAnsi="Times New Roman" w:cs="Times New Roman"/>
+        </w:rPr>
+        <w:t xml:space="preserve">Una vez verificada la base, se prepararon etiquetas más legibles para los grupos de comparación. Esto permitió trabajar no solo con la muestra completa de empleados, sino también con los subgrupos que aparecen en la Figura 2. A partir de ahí, las tasas de </w:t>
+      </w:r>
+      <w:proofErr w:type="spellStart"/>
+      <w:r>
+        <w:rPr>
+          <w:rFonts w:ascii="Times New Roman" w:hAnsi="Times New Roman" w:cs="Times New Roman"/>
+        </w:rPr>
+        <w:t>attrition</w:t>
+      </w:r>
+      <w:proofErr w:type="spellEnd"/>
+      <w:r>
+        <w:rPr>
+          <w:rFonts w:ascii="Times New Roman" w:hAnsi="Times New Roman" w:cs="Times New Roman"/>
+        </w:rPr>
+        <w:t xml:space="preserve"> se calcularon como el promedio de la variable binaria de renuncia dentro de cada grupo. El código organiza estos cálculos para la muestra total y para las divisiones por cargo, sexo y tiempo de desplazamiento. Junto con estas tasas, también se generaron valores asociados a la diferencia entre grupo de control y grupo de tratamiento y el valor p correspondiente para cada panel de la figura.</w:t>
+      </w:r>
+    </w:p>
+    <w:p>
+      <w:pPr>
+        <w:rPr>
+          <w:rFonts w:ascii="Times New Roman" w:hAnsi="Times New Roman" w:cs="Times New Roman"/>
+        </w:rPr>
+      </w:pPr>
+      <w:r>
+        <w:rPr>
+          <w:rFonts w:ascii="Times New Roman" w:hAnsi="Times New Roman" w:cs="Times New Roman"/>
+        </w:rPr>
+        <w:t xml:space="preserve">Con esos resultados se construyó una tabla resumen y se generó la imagen </w:t>
+      </w:r>
+      <w:r>
+        <w:rPr>
+          <w:rFonts w:ascii="Times New Roman" w:hAnsi="Times New Roman" w:cs="Times New Roman"/>
+          <w:b/>
+          <w:bCs/>
+          <w:i/>
+          <w:iCs/>
+        </w:rPr>
+        <w:t>figure2_replica.png</w:t>
+      </w:r>
+      <w:r>
+        <w:rPr>
+          <w:rFonts w:ascii="Times New Roman" w:hAnsi="Times New Roman" w:cs="Times New Roman"/>
+        </w:rPr>
+        <w:t xml:space="preserve">. De manera adicional, se dejó preparada una etapa de validación que toma la tabla resumen producida por la réplica, la empareja con los valores reportados en el artículo y organiza una tabla comparativa. Esa misma parte también guarda una imagen con las diferencias entre los resultados del </w:t>
+      </w:r>
+      <w:proofErr w:type="spellStart"/>
+      <w:r>
+        <w:rPr>
+          <w:rFonts w:ascii="Times New Roman" w:hAnsi="Times New Roman" w:cs="Times New Roman"/>
+        </w:rPr>
+        <w:t>paper</w:t>
+      </w:r>
+      <w:proofErr w:type="spellEnd"/>
+      <w:r>
+        <w:rPr>
+          <w:rFonts w:ascii="Times New Roman" w:hAnsi="Times New Roman" w:cs="Times New Roman"/>
+        </w:rPr>
+        <w:t xml:space="preserve"> y los resultados reproducidos, lo que facilita el paso posterior de comparación dentro de la sección de resultados y análisis.</w:t>
+      </w:r>
+    </w:p>
+    <w:p>
+      <w:pPr>
+        <w:rPr>
+          <w:rFonts w:ascii="Times New Roman" w:hAnsi="Times New Roman" w:cs="Times New Roman"/>
+          <w:b/>
+          <w:bCs/>
+        </w:rPr>
+      </w:pPr>
+      <w:r>
+        <w:rPr>
+          <w:rFonts w:ascii="Times New Roman" w:hAnsi="Times New Roman" w:cs="Times New Roman"/>
+          <w:b/>
+          <w:bCs/>
+        </w:rPr>
+        <w:t>Desafíos técnicos</w:t>
+      </w:r>
+    </w:p>
+    <w:p>
+      <w:pPr>
+        <w:rPr>
+          <w:rFonts w:ascii="Times New Roman" w:hAnsi="Times New Roman" w:cs="Times New Roman"/>
+        </w:rPr>
+      </w:pPr>
+      <w:r>
+        <w:rPr>
+          <w:rFonts w:ascii="Times New Roman" w:hAnsi="Times New Roman" w:cs="Times New Roman"/>
+        </w:rPr>
+        <w:t>Durante esta parte del trabajo aparecieron varios aspectos que requerían cuidado. Uno de ellos fue identificar con precisión cuáles archivos del material suplementario correspondían a la Figura 2, ya que el repositorio original contiene más de un insumo y no todos eran necesarios para este resultado. Para reducir ese problema, el proceso de descarga se organizó con un filtro específico por nombre, lo que permitió concentrarse solo en los archivos relevantes para esta réplica.</w:t>
+      </w:r>
+    </w:p>
+    <w:p>
+      <w:pPr>
+        <w:rPr>
+          <w:rFonts w:ascii="Times New Roman" w:hAnsi="Times New Roman" w:cs="Times New Roman"/>
+        </w:rPr>
+      </w:pPr>
+      <w:r>
+        <w:rPr>
+          <w:rFonts w:ascii="Times New Roman" w:hAnsi="Times New Roman" w:cs="Times New Roman"/>
+        </w:rPr>
+        <w:t xml:space="preserve">Otro punto importante fue el formato de los datos. Algunos archivos podían venir en formatos tabulados y no directamente en CSV, por lo que fue necesario incluir una conversión durante la descarga. También era posible que la variable de </w:t>
+      </w:r>
+      <w:proofErr w:type="spellStart"/>
+      <w:r>
+        <w:rPr>
+          <w:rFonts w:ascii="Times New Roman" w:hAnsi="Times New Roman" w:cs="Times New Roman"/>
+        </w:rPr>
+        <w:t>attrition</w:t>
+      </w:r>
+      <w:proofErr w:type="spellEnd"/>
+      <w:r>
+        <w:rPr>
+          <w:rFonts w:ascii="Times New Roman" w:hAnsi="Times New Roman" w:cs="Times New Roman"/>
+        </w:rPr>
+        <w:t xml:space="preserve"> no estuviera en la escala esperada, de modo que el script incorpora una revisión previa para normalizarla antes de hacer cualquier cálculo. Estas verificaciones ayudaron a evitar errores simples que podían afectar los porcentajes finales de la figura.</w:t>
+      </w:r>
+    </w:p>
+    <w:p>
+      <w:pPr>
+        <w:rPr>
+          <w:rFonts w:ascii="Times New Roman" w:hAnsi="Times New Roman" w:cs="Times New Roman"/>
+        </w:rPr>
+      </w:pPr>
+      <w:r>
+        <w:rPr>
+          <w:rFonts w:ascii="Times New Roman" w:hAnsi="Times New Roman" w:cs="Times New Roman"/>
+        </w:rPr>
+        <w:lastRenderedPageBreak/>
+        <w:t>También fue necesario controlar la consistencia interna de la base. El código revisa que existan las columnas necesarias, que no haya valores faltantes en las variables principales y que la codificación binaria sea coherente. En los subgrupos, cuando pueden aparecer faltantes, el script deja advertencias para que el cálculo se haga solo con los casos disponibles. Esto fue útil porque permitió continuar con el proceso sin perder de vista posibles diferencias entre la base trabajada y la estructura esperada del estudio original.</w:t>
+      </w:r>
+    </w:p>
+    <w:p>
+      <w:pPr>
+        <w:rPr>
+          <w:rFonts w:ascii="Times New Roman" w:hAnsi="Times New Roman" w:cs="Times New Roman"/>
+        </w:rPr>
+      </w:pPr>
+      <w:r>
+        <w:rPr>
+          <w:rFonts w:ascii="Times New Roman" w:hAnsi="Times New Roman" w:cs="Times New Roman"/>
+        </w:rPr>
+        <w:t xml:space="preserve">Por último, otro reto fue mantener el orden correcto de ejecución entre los archivos del proyecto. La validación no puede ejecutarse si antes no se ha generado la tabla resumen de la figura y la generación de la figura depende primero de la descarga y preparación del archivo de datos. Por eso fue importante dejar separadas las etapas del proceso y que cada una produjera una salida clara para la siguiente. De esta manera, el flujo de trabajo quedó </w:t>
+      </w:r>
+      <w:proofErr w:type="gramStart"/>
+      <w:r>
+        <w:rPr>
+          <w:rFonts w:ascii="Times New Roman" w:hAnsi="Times New Roman" w:cs="Times New Roman"/>
+        </w:rPr>
+        <w:t>más organizado y más fácil</w:t>
+      </w:r>
+      <w:proofErr w:type="gramEnd"/>
+      <w:r>
+        <w:rPr>
+          <w:rFonts w:ascii="Times New Roman" w:hAnsi="Times New Roman" w:cs="Times New Roman"/>
+        </w:rPr>
+        <w:t xml:space="preserve"> de revisar dentro del repositorio.</w:t>
+      </w:r>
+    </w:p>
     <w:p>
       <w:pPr>
         <w:pStyle w:val="Ttulo2"/>
@@ -1076,7 +1957,25 @@
           <w:sz w:val="24"/>
           <w:szCs w:val="24"/>
         </w:rPr>
-        <w:t>Para evaluar la precisión de la réplica, se comparan las tasas de renuncia reportadas en el estudio original con aquellas obtenidas a partir de los resultados reproducidos. La comparación se basa en el conjunto de resultados agregados utilizado para reconstruir la Figura 2 del artículo, que presenta las tasas de attrition (renuncia de empleados) para el grupo de control y el grupo de tratamiento bajo el esquema de trabajo híbrido.</w:t>
+        <w:t xml:space="preserve">Para evaluar la precisión de la réplica, se comparan las tasas de renuncia reportadas en el estudio original con aquellas obtenidas a partir de los resultados reproducidos. La comparación se basa en el conjunto de resultados agregados utilizado para reconstruir la Figura 2 del artículo, que presenta las tasas de </w:t>
+      </w:r>
+      <w:proofErr w:type="spellStart"/>
+      <w:r>
+        <w:rPr>
+          <w:rFonts w:ascii="Arial" w:hAnsi="Arial" w:cs="Arial"/>
+          <w:sz w:val="24"/>
+          <w:szCs w:val="24"/>
+        </w:rPr>
+        <w:t>attrition</w:t>
+      </w:r>
+      <w:proofErr w:type="spellEnd"/>
+      <w:r>
+        <w:rPr>
+          <w:rFonts w:ascii="Arial" w:hAnsi="Arial" w:cs="Arial"/>
+          <w:sz w:val="24"/>
+          <w:szCs w:val="24"/>
+        </w:rPr>
+        <w:t xml:space="preserve"> (renuncia de empleados) para el grupo de control y el grupo de tratamiento bajo el esquema de trabajo híbrido.</w:t>
       </w:r>
     </w:p>
     <w:p>
@@ -1113,7 +2012,6 @@
           <w:sz w:val="24"/>
           <w:szCs w:val="24"/>
         </w:rPr>
-        <w:lastRenderedPageBreak/>
         <w:drawing>
           <wp:inline distT="0" distB="0" distL="0" distR="0" wp14:anchorId="2360148B" wp14:editId="3800DC02">
             <wp:extent cx="5612130" cy="2770505"/>
@@ -1236,7 +2134,6 @@
           <w:sz w:val="24"/>
           <w:szCs w:val="24"/>
         </w:rPr>
-        <w:lastRenderedPageBreak/>
         <w:drawing>
           <wp:inline distT="0" distB="0" distL="0" distR="0" wp14:anchorId="14050575" wp14:editId="1FAF0CFB">
             <wp:extent cx="5612130" cy="2186940"/>
@@ -1289,42 +2186,79 @@
           <w:sz w:val="24"/>
           <w:szCs w:val="24"/>
         </w:rPr>
-        <w:t>En segundo lugar, se recalcularon las tasas de attrition como el promedio de la variable binaria que indica si un empleado renunció durante el período del experimento. Este procedimiento reproduce exactamente la lógica utilizada para construir la Figura 2 en el artículo original, donde las tasas de renuncia se presentan como proporciones dentro de cada grupo.</w:t>
-      </w:r>
-    </w:p>
-    <w:p>
-      <w:pPr>
-        <w:jc w:val="both"/>
-        <w:rPr>
-          <w:rFonts w:ascii="Arial" w:hAnsi="Arial" w:cs="Arial"/>
-          <w:sz w:val="24"/>
-          <w:szCs w:val="24"/>
-        </w:rPr>
-      </w:pPr>
-      <w:r>
-        <w:rPr>
-          <w:rFonts w:ascii="Arial" w:hAnsi="Arial" w:cs="Arial"/>
-          <w:sz w:val="24"/>
-          <w:szCs w:val="24"/>
-        </w:rPr>
-        <w:t>En tercer lugar, se compararon los resultados reproducidos con los valores publicados en el artículo. Para ello se construyó una tabla de validación que reporta las tasas de attrition originales, las tasas obtenidas en la réplica y la diferencia entre ambas. El análisis muestra que las discrepancias son mínimas y se encuentran dentro de los márgenes esperados debido a redondeo o precisión numérica.</w:t>
-      </w:r>
-    </w:p>
-    <w:p>
-      <w:pPr>
-        <w:jc w:val="both"/>
-        <w:rPr>
-          <w:rFonts w:ascii="Arial" w:hAnsi="Arial" w:cs="Arial"/>
-          <w:sz w:val="24"/>
-          <w:szCs w:val="24"/>
-        </w:rPr>
-      </w:pPr>
-      <w:r>
-        <w:rPr>
-          <w:rFonts w:ascii="Arial" w:hAnsi="Arial" w:cs="Arial"/>
-          <w:sz w:val="24"/>
-          <w:szCs w:val="24"/>
-        </w:rPr>
+        <w:t xml:space="preserve">En segundo lugar, se recalcularon las tasas de </w:t>
+      </w:r>
+      <w:proofErr w:type="spellStart"/>
+      <w:r>
+        <w:rPr>
+          <w:rFonts w:ascii="Arial" w:hAnsi="Arial" w:cs="Arial"/>
+          <w:sz w:val="24"/>
+          <w:szCs w:val="24"/>
+        </w:rPr>
+        <w:t>attrition</w:t>
+      </w:r>
+      <w:proofErr w:type="spellEnd"/>
+      <w:r>
+        <w:rPr>
+          <w:rFonts w:ascii="Arial" w:hAnsi="Arial" w:cs="Arial"/>
+          <w:sz w:val="24"/>
+          <w:szCs w:val="24"/>
+        </w:rPr>
+        <w:t xml:space="preserve"> como el promedio de la variable binaria que indica si un empleado renunció durante el período del experimento. Este procedimiento reproduce exactamente la lógica utilizada para construir la Figura 2 en el artículo original, donde las tasas de renuncia se presentan como proporciones dentro de cada grupo.</w:t>
+      </w:r>
+    </w:p>
+    <w:p>
+      <w:pPr>
+        <w:jc w:val="both"/>
+        <w:rPr>
+          <w:rFonts w:ascii="Arial" w:hAnsi="Arial" w:cs="Arial"/>
+          <w:sz w:val="24"/>
+          <w:szCs w:val="24"/>
+        </w:rPr>
+      </w:pPr>
+      <w:r>
+        <w:rPr>
+          <w:rFonts w:ascii="Arial" w:hAnsi="Arial" w:cs="Arial"/>
+          <w:sz w:val="24"/>
+          <w:szCs w:val="24"/>
+        </w:rPr>
+        <w:t xml:space="preserve">En tercer lugar, se compararon los resultados reproducidos con los valores publicados en el artículo. Para ello se construyó una tabla de validación que reporta las tasas de </w:t>
+      </w:r>
+      <w:proofErr w:type="spellStart"/>
+      <w:r>
+        <w:rPr>
+          <w:rFonts w:ascii="Arial" w:hAnsi="Arial" w:cs="Arial"/>
+          <w:sz w:val="24"/>
+          <w:szCs w:val="24"/>
+        </w:rPr>
+        <w:t>attrition</w:t>
+      </w:r>
+      <w:proofErr w:type="spellEnd"/>
+      <w:r>
+        <w:rPr>
+          <w:rFonts w:ascii="Arial" w:hAnsi="Arial" w:cs="Arial"/>
+          <w:sz w:val="24"/>
+          <w:szCs w:val="24"/>
+        </w:rPr>
+        <w:t xml:space="preserve"> originales, las tasas obtenidas en la réplica y la diferencia entre ambas. El análisis muestra que las discrepancias son mínimas y se encuentran dentro de los márgenes esperados debido a redondeo o precisión numérica.</w:t>
+      </w:r>
+    </w:p>
+    <w:p>
+      <w:pPr>
+        <w:jc w:val="both"/>
+        <w:rPr>
+          <w:rFonts w:ascii="Arial" w:hAnsi="Arial" w:cs="Arial"/>
+          <w:sz w:val="24"/>
+          <w:szCs w:val="24"/>
+        </w:rPr>
+      </w:pPr>
+      <w:r>
+        <w:rPr>
+          <w:rFonts w:ascii="Arial" w:hAnsi="Arial" w:cs="Arial"/>
+          <w:sz w:val="24"/>
+          <w:szCs w:val="24"/>
+        </w:rPr>
+        <w:lastRenderedPageBreak/>
         <w:t>Finalmente, se generó una versión replicada de la Figura 2 utilizando los resultados obtenidos en la réplica. La figura reproducida presenta el mismo patrón visual que la original: el trabajo híbrido reduce la tasa de renuncia en la muestra total y muestra efectos más fuertes para ciertos subgrupos de trabajadores. Esta consistencia visual proporciona una confirmación adicional de que los resultados empíricos fueron reproducidos correctamente.</w:t>
       </w:r>
     </w:p>
@@ -1344,7 +2278,6 @@
           <w:sz w:val="24"/>
           <w:szCs w:val="24"/>
         </w:rPr>
-        <w:lastRenderedPageBreak/>
         <w:drawing>
           <wp:inline distT="0" distB="0" distL="0" distR="0" wp14:anchorId="1991CADC" wp14:editId="09200CF4">
             <wp:extent cx="5612130" cy="3764280"/>
@@ -1456,13 +2389,25 @@
         </w:rPr>
         <w:t xml:space="preserve">El </w:t>
       </w:r>
-      <w:r>
-        <w:rPr>
-          <w:rFonts w:ascii="Arial" w:hAnsi="Arial" w:cs="Arial"/>
-          <w:sz w:val="24"/>
-          <w:szCs w:val="24"/>
-        </w:rPr>
-        <w:t>paper refleja unos resultados interesantes para el equipo y valiosos para ser replicados</w:t>
+      <w:proofErr w:type="spellStart"/>
+      <w:proofErr w:type="gramStart"/>
+      <w:r>
+        <w:rPr>
+          <w:rFonts w:ascii="Arial" w:hAnsi="Arial" w:cs="Arial"/>
+          <w:sz w:val="24"/>
+          <w:szCs w:val="24"/>
+        </w:rPr>
+        <w:t>paper</w:t>
+      </w:r>
+      <w:proofErr w:type="spellEnd"/>
+      <w:proofErr w:type="gramEnd"/>
+      <w:r>
+        <w:rPr>
+          <w:rFonts w:ascii="Arial" w:hAnsi="Arial" w:cs="Arial"/>
+          <w:sz w:val="24"/>
+          <w:szCs w:val="24"/>
+        </w:rPr>
+        <w:t xml:space="preserve"> refleja unos resultados interesantes para el equipo y valiosos para ser replicados</w:t>
       </w:r>
       <w:r>
         <w:rPr>
@@ -1730,8 +2675,19 @@
           <w:sz w:val="24"/>
           <w:szCs w:val="24"/>
         </w:rPr>
-        <w:t>Otro desafío importante fue interpretar correctamente las variables incluidas en el dataset</w:t>
-      </w:r>
+        <w:lastRenderedPageBreak/>
+        <w:t xml:space="preserve">Otro desafío importante fue interpretar correctamente las variables incluidas en el </w:t>
+      </w:r>
+      <w:proofErr w:type="spellStart"/>
+      <w:r>
+        <w:rPr>
+          <w:rFonts w:ascii="Arial" w:hAnsi="Arial" w:cs="Arial"/>
+          <w:sz w:val="24"/>
+          <w:szCs w:val="24"/>
+        </w:rPr>
+        <w:t>dataset</w:t>
+      </w:r>
+      <w:proofErr w:type="spellEnd"/>
       <w:r>
         <w:rPr>
           <w:rFonts w:ascii="Arial" w:hAnsi="Arial" w:cs="Arial"/>
@@ -1778,8 +2734,18 @@
           <w:sz w:val="24"/>
           <w:szCs w:val="24"/>
         </w:rPr>
-        <w:t>del dataset</w:t>
-      </w:r>
+        <w:t xml:space="preserve">del </w:t>
+      </w:r>
+      <w:proofErr w:type="spellStart"/>
+      <w:r>
+        <w:rPr>
+          <w:rFonts w:ascii="Arial" w:hAnsi="Arial" w:cs="Arial"/>
+          <w:sz w:val="24"/>
+          <w:szCs w:val="24"/>
+        </w:rPr>
+        <w:t>dataset</w:t>
+      </w:r>
+      <w:proofErr w:type="spellEnd"/>
       <w:r>
         <w:rPr>
           <w:rFonts w:ascii="Arial" w:hAnsi="Arial" w:cs="Arial"/>
@@ -1868,6 +2834,7 @@
         </w:rPr>
         <w:t xml:space="preserve"> de </w:t>
       </w:r>
+      <w:proofErr w:type="spellStart"/>
       <w:r>
         <w:rPr>
           <w:rFonts w:ascii="Arial" w:hAnsi="Arial" w:cs="Arial"/>
@@ -1878,6 +2845,7 @@
         </w:rPr>
         <w:t>attrition</w:t>
       </w:r>
+      <w:proofErr w:type="spellEnd"/>
       <w:r>
         <w:rPr>
           <w:rFonts w:ascii="Arial" w:hAnsi="Arial" w:cs="Arial"/>
@@ -1964,16 +2932,7 @@
           <w:sz w:val="24"/>
           <w:szCs w:val="24"/>
         </w:rPr>
-        <w:t xml:space="preserve">l promedio de </w:t>
-      </w:r>
-      <w:r>
-        <w:rPr>
-          <w:rFonts w:ascii="Arial" w:hAnsi="Arial" w:cs="Arial"/>
-          <w:sz w:val="24"/>
-          <w:szCs w:val="24"/>
-        </w:rPr>
-        <w:lastRenderedPageBreak/>
-        <w:t xml:space="preserve">dicha </w:t>
+        <w:t xml:space="preserve">l promedio de dicha </w:t>
       </w:r>
       <w:r>
         <w:rPr>
@@ -2087,7 +3046,25 @@
           <w:sz w:val="24"/>
           <w:szCs w:val="24"/>
         </w:rPr>
-        <w:t xml:space="preserve"> y especificidad en el readme del artículo, para garantizar replicabilidad con los datos.</w:t>
+        <w:t xml:space="preserve"> y especificidad en el </w:t>
+      </w:r>
+      <w:proofErr w:type="spellStart"/>
+      <w:r>
+        <w:rPr>
+          <w:rFonts w:ascii="Arial" w:hAnsi="Arial" w:cs="Arial"/>
+          <w:sz w:val="24"/>
+          <w:szCs w:val="24"/>
+        </w:rPr>
+        <w:t>readme</w:t>
+      </w:r>
+      <w:proofErr w:type="spellEnd"/>
+      <w:r>
+        <w:rPr>
+          <w:rFonts w:ascii="Arial" w:hAnsi="Arial" w:cs="Arial"/>
+          <w:sz w:val="24"/>
+          <w:szCs w:val="24"/>
+        </w:rPr>
+        <w:t xml:space="preserve"> del artículo, para garantizar replicabilidad con los datos.</w:t>
       </w:r>
     </w:p>
     <w:p>

</xml_diff>